<commit_message>
The independent set's six questions are on the board (ruling 21, amended); Units 3 and 4 rebuilt on kit 1230e4c
Co-Authored-By: Claude Opus 5.5 <noreply@anthropic.com>
Claude-Session: https://claude.ai/code/session_015xYWeLUsuszQH6z7ADE9tj
</commit_message>
<xml_diff>
--- a/a7/build/out/u3/A7 3.01 Product Laws of Exponents - Teacher Edition.docx
+++ b/a7/build/out/u3/A7 3.01 Product Laws of Exponents - Teacher Edition.docx
@@ -3390,7 +3390,7 @@
           <w:color w:val="1A1A1A"/>
           <w:sz w:val="21"/>
         </w:rPr>
-        <w:t xml:space="preserve">Independent Set — Six questions. On your own, in silence.  </w:t>
+        <w:t xml:space="preserve">Independent Set — Six questions. On your own, in writing.  </w:t>
       </w:r>
       <w:r>
         <w:rPr>
@@ -3399,7 +3399,7 @@
           <w:color w:val="1A1A1A"/>
           <w:sz w:val="21"/>
         </w:rPr>
-        <w:t>Hand out the Independent Set.</w:t>
+        <w:t>Hand out the Independent Set; the same six questions are on the board.</w:t>
       </w:r>
     </w:p>
     <w:p>

</xml_diff>